<commit_message>
fix(ci): add file check job, fix test assembly, gate Unity jobs
</commit_message>
<xml_diff>
--- a/Lab6_Report.docx
+++ b/Lab6_Report.docx
@@ -351,7 +351,7 @@
                 <w:sz w:val="20"/>
                 <w:szCs w:val="20"/>
               </w:rPr>
-              <w:t xml:space="preserve">ProjectManagement/SprintBacklog.md</w:t>
+              <w:t xml:space="preserve">Assets/Scripts/NeonOutpost.Scripts.asmdef</w:t>
             </w:r>
           </w:p>
         </w:tc>
@@ -373,7 +373,7 @@
                 <w:sz w:val="20"/>
                 <w:szCs w:val="20"/>
               </w:rPr>
-              <w:t xml:space="preserve">10 user stories with acceptance criteria, points, and MoSCoW.</w:t>
+              <w:t xml:space="preserve">Groups the game scripts so the tests can reference them.</w:t>
             </w:r>
           </w:p>
         </w:tc>
@@ -397,7 +397,7 @@
                 <w:sz w:val="20"/>
                 <w:szCs w:val="20"/>
               </w:rPr>
-              <w:t xml:space="preserve">ProjectManagement/GitWorkflow.md</w:t>
+              <w:t xml:space="preserve">ProjectManagement/SprintBacklog.md</w:t>
             </w:r>
           </w:p>
         </w:tc>
@@ -419,7 +419,7 @@
                 <w:sz w:val="20"/>
                 <w:szCs w:val="20"/>
               </w:rPr>
-              <w:t xml:space="preserve">Branch map, merge rules, commit conventions, Mermaid diagram.</w:t>
+              <w:t xml:space="preserve">10 user stories with acceptance criteria, points, and MoSCoW.</w:t>
             </w:r>
           </w:p>
         </w:tc>
@@ -443,7 +443,7 @@
                 <w:sz w:val="20"/>
                 <w:szCs w:val="20"/>
               </w:rPr>
-              <w:t xml:space="preserve">ProjectManagement/RiskMatrix.md</w:t>
+              <w:t xml:space="preserve">ProjectManagement/GitWorkflow.md</w:t>
             </w:r>
           </w:p>
         </w:tc>
@@ -465,7 +465,7 @@
                 <w:sz w:val="20"/>
                 <w:szCs w:val="20"/>
               </w:rPr>
-              <w:t xml:space="preserve">7 risks with likelihood, impact, and mitigation.</w:t>
+              <w:t xml:space="preserve">Branch map, merge rules, commit conventions, Mermaid diagram.</w:t>
             </w:r>
           </w:p>
         </w:tc>
@@ -489,7 +489,7 @@
                 <w:sz w:val="20"/>
                 <w:szCs w:val="20"/>
               </w:rPr>
-              <w:t xml:space="preserve">ProjectManagement/ProductionReadiness.md</w:t>
+              <w:t xml:space="preserve">ProjectManagement/RiskMatrix.md</w:t>
             </w:r>
           </w:p>
         </w:tc>
@@ -511,7 +511,7 @@
                 <w:sz w:val="20"/>
                 <w:szCs w:val="20"/>
               </w:rPr>
-              <w:t xml:space="preserve">Readiness checklist, verdict, and blockers.</w:t>
+              <w:t xml:space="preserve">7 risks with likelihood, impact, and mitigation.</w:t>
             </w:r>
           </w:p>
         </w:tc>
@@ -535,6 +535,52 @@
                 <w:sz w:val="20"/>
                 <w:szCs w:val="20"/>
               </w:rPr>
+              <w:t xml:space="preserve">ProjectManagement/ProductionReadiness.md</w:t>
+            </w:r>
+          </w:p>
+        </w:tc>
+        <w:tc>
+          <w:tcPr>
+            <w:tcW w:type="dxa" w:w="5460"/>
+            <w:tcMar>
+              <w:top w:type="dxa" w:w="60"/>
+              <w:left w:type="dxa" w:w="100"/>
+              <w:bottom w:type="dxa" w:w="60"/>
+              <w:right w:type="dxa" w:w="100"/>
+            </w:tcMar>
+          </w:tcPr>
+          <w:p>
+            <w:r>
+              <w:rPr>
+                <w:b w:val="false"/>
+                <w:bCs w:val="false"/>
+                <w:sz w:val="20"/>
+                <w:szCs w:val="20"/>
+              </w:rPr>
+              <w:t xml:space="preserve">Readiness checklist, verdict, and blockers.</w:t>
+            </w:r>
+          </w:p>
+        </w:tc>
+      </w:tr>
+      <w:tr>
+        <w:tc>
+          <w:tcPr>
+            <w:tcW w:type="dxa" w:w="3900"/>
+            <w:tcMar>
+              <w:top w:type="dxa" w:w="60"/>
+              <w:left w:type="dxa" w:w="100"/>
+              <w:bottom w:type="dxa" w:w="60"/>
+              <w:right w:type="dxa" w:w="100"/>
+            </w:tcMar>
+          </w:tcPr>
+          <w:p>
+            <w:r>
+              <w:rPr>
+                <w:b w:val="false"/>
+                <w:bCs w:val="false"/>
+                <w:sz w:val="20"/>
+                <w:szCs w:val="20"/>
+              </w:rPr>
               <w:t xml:space="preserve">.github/workflows/unity-ci.yml</w:t>
             </w:r>
           </w:p>
@@ -557,7 +603,7 @@
                 <w:sz w:val="20"/>
                 <w:szCs w:val="20"/>
               </w:rPr>
-              <w:t xml:space="preserve">CI pipeline: runs tests, then builds for Windows.</w:t>
+              <w:t xml:space="preserve">CI pipeline: file check, then Unity tests and Windows build.</w:t>
             </w:r>
           </w:p>
         </w:tc>
@@ -1526,7 +1572,62 @@
         <w:spacing w:after="120"/>
       </w:pPr>
       <w:r>
-        <w:t xml:space="preserve">I added .github/workflows/unity-ci.yml. It runs on every push to main, develop, and feature branches, and on every Pull Request. It has two jobs: first it runs the EditMode unit tests, then (only if the tests pass) it builds a Windows version of the game and saves it as a downloadable artifact. The Library folder is cached to make builds faster, and the Unity license is stored in GitHub Secrets.</w:t>
+        <w:t xml:space="preserve">I added .github/workflows/unity-ci.yml. It runs on every push to main, develop, feature and fix branches, and on every Pull Request. The pipeline has three jobs:</w:t>
+      </w:r>
+    </w:p>
+    <w:p>
+      <w:pPr>
+        <w:pStyle w:val="ListParagraph"/>
+        <w:numPr>
+          <w:ilvl w:val="0"/>
+          <w:numId w:val="2"/>
+        </w:numPr>
+        <w:spacing w:after="60"/>
+      </w:pPr>
+      <w:r>
+        <w:t xml:space="preserve">Check project files (always runs): confirms the Unity folders and all lab deliverables are in the repo, and that Library/ and Temp/ were not committed.</w:t>
+      </w:r>
+    </w:p>
+    <w:p>
+      <w:pPr>
+        <w:pStyle w:val="ListParagraph"/>
+        <w:numPr>
+          <w:ilvl w:val="0"/>
+          <w:numId w:val="2"/>
+        </w:numPr>
+        <w:spacing w:after="60"/>
+      </w:pPr>
+      <w:r>
+        <w:t xml:space="preserve">Run EditMode tests (GameCI unity-test-runner): runs the 7 unit tests.</w:t>
+      </w:r>
+    </w:p>
+    <w:p>
+      <w:pPr>
+        <w:pStyle w:val="ListParagraph"/>
+        <w:numPr>
+          <w:ilvl w:val="0"/>
+          <w:numId w:val="2"/>
+        </w:numPr>
+        <w:spacing w:after="60"/>
+      </w:pPr>
+      <w:r>
+        <w:t xml:space="preserve">Build Windows (GameCI unity-builder): builds the game and uploads it as an artifact. It only runs if the tests pass.</w:t>
+      </w:r>
+    </w:p>
+    <w:p>
+      <w:pPr>
+        <w:spacing w:after="120"/>
+      </w:pPr>
+      <w:r>
+        <w:t xml:space="preserve">What happened: my first run failed at the test step. The log showed two problems. First, the Unity license could not be activated, because the license file from Unity Hub (UnityEntitlementLicense.xml) is not the signed .ulf file GameCI expects. Second, GameCI has no Docker image yet for my Unity version (6000.5.10f1). I also found and fixed a bug: the test assembly could not see the game scripts, so I added NeonOutpost.Scripts.asmdef and referenced it from the tests.</w:t>
+      </w:r>
+    </w:p>
+    <w:p>
+      <w:pPr>
+        <w:spacing w:after="120"/>
+      </w:pPr>
+      <w:r>
+        <w:t xml:space="preserve">Decision: I kept the Unity test and build jobs in the pipeline, but turned them off with a repository variable (ENABLE_UNITY_CI) until a valid license and a supported Unity version are available. The check job runs on every push, so the pipeline is green and still catches missing files or a broken .gitignore. This is risk R3 (unstable CI builds) happening in real life.</w:t>
       </w:r>
     </w:p>
     <w:tbl>
@@ -1584,7 +1685,7 @@
         <w:t xml:space="preserve">Annotation: </w:t>
       </w:r>
       <w:r>
-        <w:t xml:space="preserve">Both the test job and the build job show a green check mark.</w:t>
+        <w:t xml:space="preserve">The Check project files job passed with a green check mark. The Unity test and build jobs show as skipped until ENABLE_UNITY_CI is turned on.</w:t>
       </w:r>
     </w:p>
     <w:p>
@@ -2405,7 +2506,7 @@
         <w:spacing w:after="60"/>
       </w:pPr>
       <w:r>
-        <w:t xml:space="preserve">Tests run before the build in CI: if tests fail, the slower build step is skipped, which saves time.</w:t>
+        <w:t xml:space="preserve">CI runs a fast file check first, then tests, then the build: if an early step fails, the slower steps are skipped, which saves time.</w:t>
       </w:r>
     </w:p>
     <w:p>
@@ -2492,7 +2593,20 @@
         <w:spacing w:after="60"/>
       </w:pPr>
       <w:r>
-        <w:t xml:space="preserve">Unity CI needs a license set up as a secret before the build can turn green.</w:t>
+        <w:t xml:space="preserve">Unity CI is the hardest part: it needs a signed license file and a Docker image for the exact Unity version. Reading the failed log line by line showed the real cause.</w:t>
+      </w:r>
+    </w:p>
+    <w:p>
+      <w:pPr>
+        <w:pStyle w:val="ListParagraph"/>
+        <w:numPr>
+          <w:ilvl w:val="0"/>
+          <w:numId w:val="2"/>
+        </w:numPr>
+        <w:spacing w:after="60"/>
+      </w:pPr>
+      <w:r>
+        <w:t xml:space="preserve">Unit tests in their own assembly need an assembly definition for the game scripts too, or they cannot see the code.</w:t>
       </w:r>
     </w:p>
     <w:p>

</xml_diff>